<commit_message>
chore(templates): update contract templates and forms (#849)
Routine refresh of contract template and external-form artifacts and catalog metadata. Contributions are welcome — open an issue or pull request and we'll fold it in.

Co-authored-by: OpenAgreements <noreply@openagreements.org>
</commit_message>
<xml_diff>
--- a/templates/common-paper-cc-by-4.0/common-paper-letter-of-intent/template.docx
+++ b/templates/common-paper-cc-by-4.0/common-paper-letter-of-intent/template.docx
@@ -1834,6 +1834,11 @@
               </w:rPr>
             </w:pPr>
             <w:r>
+              <w:rPr>
+                <w:rFonts w:ascii="Arial" w:eastAsia="Arial" w:hAnsi="Arial" w:cs="Arial"/>
+                <w:sz w:val="18"/>
+                <w:szCs w:val="18"/>
+              </w:rPr>
               <w:t>{provider_signatory_name}</w:t>
             </w:r>
           </w:p>
@@ -1887,6 +1892,11 @@
               </w:rPr>
             </w:pPr>
             <w:r>
+              <w:rPr>
+                <w:rFonts w:ascii="Arial" w:eastAsia="Arial" w:hAnsi="Arial" w:cs="Arial"/>
+                <w:sz w:val="18"/>
+                <w:szCs w:val="18"/>
+              </w:rPr>
               <w:t>{customer_signatory_name}</w:t>
             </w:r>
           </w:p>
@@ -1952,6 +1962,11 @@
               </w:rPr>
             </w:pPr>
             <w:r>
+              <w:rPr>
+                <w:rFonts w:ascii="Arial" w:eastAsia="Arial" w:hAnsi="Arial" w:cs="Arial"/>
+                <w:sz w:val="18"/>
+                <w:szCs w:val="18"/>
+              </w:rPr>
               <w:t>{provider_signatory_title_display}</w:t>
             </w:r>
           </w:p>
@@ -2005,6 +2020,11 @@
               </w:rPr>
             </w:pPr>
             <w:r>
+              <w:rPr>
+                <w:rFonts w:ascii="Arial" w:eastAsia="Arial" w:hAnsi="Arial" w:cs="Arial"/>
+                <w:sz w:val="18"/>
+                <w:szCs w:val="18"/>
+              </w:rPr>
               <w:t>{customer_signatory_title_display}</w:t>
             </w:r>
           </w:p>
@@ -2097,6 +2117,11 @@
               </w:rPr>
             </w:pPr>
             <w:r>
+              <w:rPr>
+                <w:rFonts w:ascii="Arial" w:eastAsia="Arial" w:hAnsi="Arial" w:cs="Arial"/>
+                <w:sz w:val="18"/>
+                <w:szCs w:val="18"/>
+              </w:rPr>
               <w:t>{provider_signatory_email}</w:t>
             </w:r>
           </w:p>
@@ -2150,6 +2175,11 @@
               </w:rPr>
             </w:pPr>
             <w:r>
+              <w:rPr>
+                <w:rFonts w:ascii="Arial" w:eastAsia="Arial" w:hAnsi="Arial" w:cs="Arial"/>
+                <w:sz w:val="18"/>
+                <w:szCs w:val="18"/>
+              </w:rPr>
               <w:t>{customer_signatory_email}</w:t>
             </w:r>
           </w:p>

</xml_diff>